<commit_message>
Pair per-class detection performance with the annotation distribution
Section 5.2 showed the effect of signal starvation (6.35-point spread,
pepsi collapsing to zero) without the cause. Adds each class's share of
the annotation budget alongside its measured performance, from the live
project: coca-cola holds 42.6% of the 4,879 annotations while pepsi
holds 2.7%.

Reads the result honestly rather than as a simple more-data-is-better
trend, which the numbers do not support — xl_energy outperforms
coca-cola on a third of its annotations. The defensible reading is a
floor of representation: above it performance settles into a narrow
band, below it a class collapses outright, and pepsi is the only class
beneath it.

Co-Authored-By: Claude Opus 5 <noreply@anthropic.com>
Claude-Session: https://claude.ai/code/session_012XpwBQVzqbnTeSceeR5m1B
</commit_message>
<xml_diff>
--- a/docs/report/out/Aystro_Research_Report_AR.docx
+++ b/docs/report/out/Aystro_Research_Report_AR.docx
@@ -2836,7 +2836,7 @@
           <w:rtl/>
           <w:cs/>
         </w:rPr>
-        <w:t>يكشف التفصيل الصنفي لأداء النهج الأحادي آلية القيد الإحصائي الذي تنبّأت به الفرضية.</w:t>
+        <w:t>يكشف التفصيل الصنفي لأداء النهج الأحادي آلية القيد الإحصائي الذي تنبّأت به الفرضية. ويُعرَض هنا إلى جانب توزيع التعليم في المشروع نفسه، ليقابَل الأثر بسببه المباشر.</w:t>
       </w:r>
     </w:p>
     <w:p>
@@ -2871,7 +2871,7 @@
           <w:rtl/>
           <w:cs/>
         </w:rPr>
-        <w:t>الأداء الصنفي للكاشف الأحادي: تفاوت ٦٫٣٥ نقطة بين الأصناف المُمثَّلة، وانهيار كامل لصنف غير مُمثَّل.</w:t>
+        <w:t>الأداء الصنفي للكاشف الأحادي مقابل نصيب كل صنف من التعليم. المجموع ٤٬٨٧٩ تعليماً.</w:t>
       </w:r>
     </w:p>
     <w:tbl>
@@ -2883,15 +2883,17 @@
         <w:tblLook w:firstColumn="1" w:firstRow="1" w:lastColumn="0" w:lastRow="0" w:noHBand="0" w:noVBand="1" w:val="04A0"/>
       </w:tblPr>
       <w:tblGrid>
-        <w:gridCol w:w="2239"/>
-        <w:gridCol w:w="2239"/>
-        <w:gridCol w:w="2239"/>
-        <w:gridCol w:w="2239"/>
+        <w:gridCol w:w="1493"/>
+        <w:gridCol w:w="1493"/>
+        <w:gridCol w:w="1493"/>
+        <w:gridCol w:w="1493"/>
+        <w:gridCol w:w="1493"/>
+        <w:gridCol w:w="1493"/>
       </w:tblGrid>
       <w:tr>
         <w:tc>
           <w:tcPr>
-            <w:tcW w:type="dxa" w:w="2239"/>
+            <w:tcW w:type="dxa" w:w="1493"/>
           </w:tcPr>
           <w:p>
             <w:pPr>
@@ -2923,7 +2925,7 @@
         </w:tc>
         <w:tc>
           <w:tcPr>
-            <w:tcW w:type="dxa" w:w="2239"/>
+            <w:tcW w:type="dxa" w:w="1493"/>
           </w:tcPr>
           <w:p>
             <w:pPr>
@@ -2949,13 +2951,13 @@
                 <w:rtl/>
                 <w:cs/>
               </w:rPr>
-              <w:t>mAP50</w:t>
+              <w:t>التعليمات</w:t>
             </w:r>
           </w:p>
         </w:tc>
         <w:tc>
           <w:tcPr>
-            <w:tcW w:type="dxa" w:w="2239"/>
+            <w:tcW w:type="dxa" w:w="1493"/>
           </w:tcPr>
           <w:p>
             <w:pPr>
@@ -2981,13 +2983,13 @@
                 <w:rtl/>
                 <w:cs/>
               </w:rPr>
-              <w:t>الإحكام</w:t>
+              <w:t>الحصة</w:t>
             </w:r>
           </w:p>
         </w:tc>
         <w:tc>
           <w:tcPr>
-            <w:tcW w:type="dxa" w:w="2239"/>
+            <w:tcW w:type="dxa" w:w="1493"/>
           </w:tcPr>
           <w:p>
             <w:pPr>
@@ -3013,15 +3015,13 @@
                 <w:rtl/>
                 <w:cs/>
               </w:rPr>
-              <w:t>الاستدعاء</w:t>
+              <w:t>mAP50</w:t>
             </w:r>
           </w:p>
         </w:tc>
-      </w:tr>
-      <w:tr>
         <w:tc>
           <w:tcPr>
-            <w:tcW w:type="dxa" w:w="2239"/>
+            <w:tcW w:type="dxa" w:w="1493"/>
           </w:tcPr>
           <w:p>
             <w:pPr>
@@ -3038,7 +3038,8 @@
             <w:r>
               <w:rPr>
                 <w:rFonts w:ascii="Times New Roman" w:hAnsi="Times New Roman" w:cs="Noto Naskh Arabic"/>
-                <w:b w:val="0"/>
+                <w:b/>
+                <w:bCs w:val="1"/>
                 <w:i w:val="0"/>
                 <w:color w:val="111111"/>
                 <w:sz w:val="20"/>
@@ -3046,13 +3047,13 @@
                 <w:rtl/>
                 <w:cs/>
               </w:rPr>
-              <w:t>xl_energy</w:t>
+              <w:t>الإحكام</w:t>
             </w:r>
           </w:p>
         </w:tc>
         <w:tc>
           <w:tcPr>
-            <w:tcW w:type="dxa" w:w="2239"/>
+            <w:tcW w:type="dxa" w:w="1493"/>
           </w:tcPr>
           <w:p>
             <w:pPr>
@@ -3069,7 +3070,8 @@
             <w:r>
               <w:rPr>
                 <w:rFonts w:ascii="Times New Roman" w:hAnsi="Times New Roman" w:cs="Noto Naskh Arabic"/>
-                <w:b w:val="0"/>
+                <w:b/>
+                <w:bCs w:val="1"/>
                 <w:i w:val="0"/>
                 <w:color w:val="111111"/>
                 <w:sz w:val="20"/>
@@ -3077,13 +3079,15 @@
                 <w:rtl/>
                 <w:cs/>
               </w:rPr>
-              <w:t>٩١٫٩٧٪</w:t>
+              <w:t>الاستدعاء</w:t>
             </w:r>
           </w:p>
         </w:tc>
+      </w:tr>
+      <w:tr>
         <w:tc>
           <w:tcPr>
-            <w:tcW w:type="dxa" w:w="2239"/>
+            <w:tcW w:type="dxa" w:w="1493"/>
           </w:tcPr>
           <w:p>
             <w:pPr>
@@ -3108,13 +3112,13 @@
                 <w:rtl/>
                 <w:cs/>
               </w:rPr>
-              <w:t>٩٠٫٤٪</w:t>
+              <w:t>coca-cola</w:t>
             </w:r>
           </w:p>
         </w:tc>
         <w:tc>
           <w:tcPr>
-            <w:tcW w:type="dxa" w:w="2239"/>
+            <w:tcW w:type="dxa" w:w="1493"/>
           </w:tcPr>
           <w:p>
             <w:pPr>
@@ -3139,15 +3143,13 @@
                 <w:rtl/>
                 <w:cs/>
               </w:rPr>
-              <w:t>٩٠٫٤٪</w:t>
+              <w:t>٢٬٠٧٩</w:t>
             </w:r>
           </w:p>
         </w:tc>
-      </w:tr>
-      <w:tr>
         <w:tc>
           <w:tcPr>
-            <w:tcW w:type="dxa" w:w="2239"/>
+            <w:tcW w:type="dxa" w:w="1493"/>
           </w:tcPr>
           <w:p>
             <w:pPr>
@@ -3172,13 +3174,13 @@
                 <w:rtl/>
                 <w:cs/>
               </w:rPr>
-              <w:t>coca-cola</w:t>
+              <w:t>٤٢٫٦٪</w:t>
             </w:r>
           </w:p>
         </w:tc>
         <w:tc>
           <w:tcPr>
-            <w:tcW w:type="dxa" w:w="2239"/>
+            <w:tcW w:type="dxa" w:w="1493"/>
           </w:tcPr>
           <w:p>
             <w:pPr>
@@ -3209,7 +3211,7 @@
         </w:tc>
         <w:tc>
           <w:tcPr>
-            <w:tcW w:type="dxa" w:w="2239"/>
+            <w:tcW w:type="dxa" w:w="1493"/>
           </w:tcPr>
           <w:p>
             <w:pPr>
@@ -3240,7 +3242,7 @@
         </w:tc>
         <w:tc>
           <w:tcPr>
-            <w:tcW w:type="dxa" w:w="2239"/>
+            <w:tcW w:type="dxa" w:w="1493"/>
           </w:tcPr>
           <w:p>
             <w:pPr>
@@ -3273,7 +3275,7 @@
       <w:tr>
         <w:tc>
           <w:tcPr>
-            <w:tcW w:type="dxa" w:w="2239"/>
+            <w:tcW w:type="dxa" w:w="1493"/>
           </w:tcPr>
           <w:p>
             <w:pPr>
@@ -3298,13 +3300,13 @@
                 <w:rtl/>
                 <w:cs/>
               </w:rPr>
-              <w:t>sprite</w:t>
+              <w:t>cappy</w:t>
             </w:r>
           </w:p>
         </w:tc>
         <w:tc>
           <w:tcPr>
-            <w:tcW w:type="dxa" w:w="2239"/>
+            <w:tcW w:type="dxa" w:w="1493"/>
           </w:tcPr>
           <w:p>
             <w:pPr>
@@ -3329,13 +3331,13 @@
                 <w:rtl/>
                 <w:cs/>
               </w:rPr>
-              <w:t>٨٨٫٢٩٪</w:t>
+              <w:t>٩٤٨</w:t>
             </w:r>
           </w:p>
         </w:tc>
         <w:tc>
           <w:tcPr>
-            <w:tcW w:type="dxa" w:w="2239"/>
+            <w:tcW w:type="dxa" w:w="1493"/>
           </w:tcPr>
           <w:p>
             <w:pPr>
@@ -3360,13 +3362,13 @@
                 <w:rtl/>
                 <w:cs/>
               </w:rPr>
-              <w:t>٨٥٫١٪</w:t>
+              <w:t>١٩٫٤٪</w:t>
             </w:r>
           </w:p>
         </w:tc>
         <w:tc>
           <w:tcPr>
-            <w:tcW w:type="dxa" w:w="2239"/>
+            <w:tcW w:type="dxa" w:w="1493"/>
           </w:tcPr>
           <w:p>
             <w:pPr>
@@ -3391,15 +3393,13 @@
                 <w:rtl/>
                 <w:cs/>
               </w:rPr>
-              <w:t>٨٧٫٧٪</w:t>
+              <w:t>٨٥٫٦٢٪</w:t>
             </w:r>
           </w:p>
         </w:tc>
-      </w:tr>
-      <w:tr>
         <w:tc>
           <w:tcPr>
-            <w:tcW w:type="dxa" w:w="2239"/>
+            <w:tcW w:type="dxa" w:w="1493"/>
           </w:tcPr>
           <w:p>
             <w:pPr>
@@ -3424,13 +3424,13 @@
                 <w:rtl/>
                 <w:cs/>
               </w:rPr>
-              <w:t>fanta</w:t>
+              <w:t>٨٧٫٨٪</w:t>
             </w:r>
           </w:p>
         </w:tc>
         <w:tc>
           <w:tcPr>
-            <w:tcW w:type="dxa" w:w="2239"/>
+            <w:tcW w:type="dxa" w:w="1493"/>
           </w:tcPr>
           <w:p>
             <w:pPr>
@@ -3455,13 +3455,15 @@
                 <w:rtl/>
                 <w:cs/>
               </w:rPr>
-              <w:t>٨٧٫٩٨٪</w:t>
+              <w:t>٨١٫٥٪</w:t>
             </w:r>
           </w:p>
         </w:tc>
+      </w:tr>
+      <w:tr>
         <w:tc>
           <w:tcPr>
-            <w:tcW w:type="dxa" w:w="2239"/>
+            <w:tcW w:type="dxa" w:w="1493"/>
           </w:tcPr>
           <w:p>
             <w:pPr>
@@ -3486,13 +3488,13 @@
                 <w:rtl/>
                 <w:cs/>
               </w:rPr>
-              <w:t>٨٨٫٩٪</w:t>
+              <w:t>xl_energy</w:t>
             </w:r>
           </w:p>
         </w:tc>
         <w:tc>
           <w:tcPr>
-            <w:tcW w:type="dxa" w:w="2239"/>
+            <w:tcW w:type="dxa" w:w="1493"/>
           </w:tcPr>
           <w:p>
             <w:pPr>
@@ -3517,15 +3519,13 @@
                 <w:rtl/>
                 <w:cs/>
               </w:rPr>
-              <w:t>٩٠٫٣٪</w:t>
+              <w:t>٦٦١</w:t>
             </w:r>
           </w:p>
         </w:tc>
-      </w:tr>
-      <w:tr>
         <w:tc>
           <w:tcPr>
-            <w:tcW w:type="dxa" w:w="2239"/>
+            <w:tcW w:type="dxa" w:w="1493"/>
           </w:tcPr>
           <w:p>
             <w:pPr>
@@ -3550,13 +3550,13 @@
                 <w:rtl/>
                 <w:cs/>
               </w:rPr>
-              <w:t>cappy</w:t>
+              <w:t>١٣٫٥٪</w:t>
             </w:r>
           </w:p>
         </w:tc>
         <w:tc>
           <w:tcPr>
-            <w:tcW w:type="dxa" w:w="2239"/>
+            <w:tcW w:type="dxa" w:w="1493"/>
           </w:tcPr>
           <w:p>
             <w:pPr>
@@ -3581,13 +3581,13 @@
                 <w:rtl/>
                 <w:cs/>
               </w:rPr>
-              <w:t>٨٥٫٦٢٪</w:t>
+              <w:t>٩١٫٩٧٪</w:t>
             </w:r>
           </w:p>
         </w:tc>
         <w:tc>
           <w:tcPr>
-            <w:tcW w:type="dxa" w:w="2239"/>
+            <w:tcW w:type="dxa" w:w="1493"/>
           </w:tcPr>
           <w:p>
             <w:pPr>
@@ -3612,13 +3612,13 @@
                 <w:rtl/>
                 <w:cs/>
               </w:rPr>
-              <w:t>٨٧٫٨٪</w:t>
+              <w:t>٩٠٫٤٪</w:t>
             </w:r>
           </w:p>
         </w:tc>
         <w:tc>
           <w:tcPr>
-            <w:tcW w:type="dxa" w:w="2239"/>
+            <w:tcW w:type="dxa" w:w="1493"/>
           </w:tcPr>
           <w:p>
             <w:pPr>
@@ -3643,7 +3643,7 @@
                 <w:rtl/>
                 <w:cs/>
               </w:rPr>
-              <w:t>٨١٫٥٪</w:t>
+              <w:t>٩٠٫٤٪</w:t>
             </w:r>
           </w:p>
         </w:tc>
@@ -3651,7 +3651,7 @@
       <w:tr>
         <w:tc>
           <w:tcPr>
-            <w:tcW w:type="dxa" w:w="2239"/>
+            <w:tcW w:type="dxa" w:w="1493"/>
           </w:tcPr>
           <w:p>
             <w:pPr>
@@ -3676,13 +3676,13 @@
                 <w:rtl/>
                 <w:cs/>
               </w:rPr>
-              <w:t>pepsi</w:t>
+              <w:t>sprite</w:t>
             </w:r>
           </w:p>
         </w:tc>
         <w:tc>
           <w:tcPr>
-            <w:tcW w:type="dxa" w:w="2239"/>
+            <w:tcW w:type="dxa" w:w="1493"/>
           </w:tcPr>
           <w:p>
             <w:pPr>
@@ -3707,13 +3707,13 @@
                 <w:rtl/>
                 <w:cs/>
               </w:rPr>
-              <w:t>—</w:t>
+              <w:t>٦٥١</w:t>
             </w:r>
           </w:p>
         </w:tc>
         <w:tc>
           <w:tcPr>
-            <w:tcW w:type="dxa" w:w="2239"/>
+            <w:tcW w:type="dxa" w:w="1493"/>
           </w:tcPr>
           <w:p>
             <w:pPr>
@@ -3738,13 +3738,451 @@
                 <w:rtl/>
                 <w:cs/>
               </w:rPr>
-              <w:t>٠٪</w:t>
+              <w:t>١٣٫٣٪</w:t>
             </w:r>
           </w:p>
         </w:tc>
         <w:tc>
           <w:tcPr>
-            <w:tcW w:type="dxa" w:w="2239"/>
+            <w:tcW w:type="dxa" w:w="1493"/>
+          </w:tcPr>
+          <w:p>
+            <w:pPr>
+              <w:bidi/>
+              <w:spacing w:before="60" w:after="60"/>
+              <w:jc w:val="right"/>
+            </w:pPr>
+            <w:r>
+              <w:rPr>
+                <w:rtl/>
+                <w:cs/>
+              </w:rPr>
+            </w:r>
+            <w:r>
+              <w:rPr>
+                <w:rFonts w:ascii="Times New Roman" w:hAnsi="Times New Roman" w:cs="Noto Naskh Arabic"/>
+                <w:b w:val="0"/>
+                <w:i w:val="0"/>
+                <w:color w:val="111111"/>
+                <w:sz w:val="20"/>
+                <w:szCs w:val="20"/>
+                <w:rtl/>
+                <w:cs/>
+              </w:rPr>
+              <w:t>٨٨٫٢٩٪</w:t>
+            </w:r>
+          </w:p>
+        </w:tc>
+        <w:tc>
+          <w:tcPr>
+            <w:tcW w:type="dxa" w:w="1493"/>
+          </w:tcPr>
+          <w:p>
+            <w:pPr>
+              <w:bidi/>
+              <w:spacing w:before="60" w:after="60"/>
+              <w:jc w:val="right"/>
+            </w:pPr>
+            <w:r>
+              <w:rPr>
+                <w:rtl/>
+                <w:cs/>
+              </w:rPr>
+            </w:r>
+            <w:r>
+              <w:rPr>
+                <w:rFonts w:ascii="Times New Roman" w:hAnsi="Times New Roman" w:cs="Noto Naskh Arabic"/>
+                <w:b w:val="0"/>
+                <w:i w:val="0"/>
+                <w:color w:val="111111"/>
+                <w:sz w:val="20"/>
+                <w:szCs w:val="20"/>
+                <w:rtl/>
+                <w:cs/>
+              </w:rPr>
+              <w:t>٨٥٫١٪</w:t>
+            </w:r>
+          </w:p>
+        </w:tc>
+        <w:tc>
+          <w:tcPr>
+            <w:tcW w:type="dxa" w:w="1493"/>
+          </w:tcPr>
+          <w:p>
+            <w:pPr>
+              <w:bidi/>
+              <w:spacing w:before="60" w:after="60"/>
+              <w:jc w:val="right"/>
+            </w:pPr>
+            <w:r>
+              <w:rPr>
+                <w:rtl/>
+                <w:cs/>
+              </w:rPr>
+            </w:r>
+            <w:r>
+              <w:rPr>
+                <w:rFonts w:ascii="Times New Roman" w:hAnsi="Times New Roman" w:cs="Noto Naskh Arabic"/>
+                <w:b w:val="0"/>
+                <w:i w:val="0"/>
+                <w:color w:val="111111"/>
+                <w:sz w:val="20"/>
+                <w:szCs w:val="20"/>
+                <w:rtl/>
+                <w:cs/>
+              </w:rPr>
+              <w:t>٨٧٫٧٪</w:t>
+            </w:r>
+          </w:p>
+        </w:tc>
+      </w:tr>
+      <w:tr>
+        <w:tc>
+          <w:tcPr>
+            <w:tcW w:type="dxa" w:w="1493"/>
+          </w:tcPr>
+          <w:p>
+            <w:pPr>
+              <w:bidi/>
+              <w:spacing w:before="60" w:after="60"/>
+              <w:jc w:val="right"/>
+            </w:pPr>
+            <w:r>
+              <w:rPr>
+                <w:rtl/>
+                <w:cs/>
+              </w:rPr>
+            </w:r>
+            <w:r>
+              <w:rPr>
+                <w:rFonts w:ascii="Times New Roman" w:hAnsi="Times New Roman" w:cs="Noto Naskh Arabic"/>
+                <w:b w:val="0"/>
+                <w:i w:val="0"/>
+                <w:color w:val="111111"/>
+                <w:sz w:val="20"/>
+                <w:szCs w:val="20"/>
+                <w:rtl/>
+                <w:cs/>
+              </w:rPr>
+              <w:t>fanta</w:t>
+            </w:r>
+          </w:p>
+        </w:tc>
+        <w:tc>
+          <w:tcPr>
+            <w:tcW w:type="dxa" w:w="1493"/>
+          </w:tcPr>
+          <w:p>
+            <w:pPr>
+              <w:bidi/>
+              <w:spacing w:before="60" w:after="60"/>
+              <w:jc w:val="right"/>
+            </w:pPr>
+            <w:r>
+              <w:rPr>
+                <w:rtl/>
+                <w:cs/>
+              </w:rPr>
+            </w:r>
+            <w:r>
+              <w:rPr>
+                <w:rFonts w:ascii="Times New Roman" w:hAnsi="Times New Roman" w:cs="Noto Naskh Arabic"/>
+                <w:b w:val="0"/>
+                <w:i w:val="0"/>
+                <w:color w:val="111111"/>
+                <w:sz w:val="20"/>
+                <w:szCs w:val="20"/>
+                <w:rtl/>
+                <w:cs/>
+              </w:rPr>
+              <w:t>٤٠٩</w:t>
+            </w:r>
+          </w:p>
+        </w:tc>
+        <w:tc>
+          <w:tcPr>
+            <w:tcW w:type="dxa" w:w="1493"/>
+          </w:tcPr>
+          <w:p>
+            <w:pPr>
+              <w:bidi/>
+              <w:spacing w:before="60" w:after="60"/>
+              <w:jc w:val="right"/>
+            </w:pPr>
+            <w:r>
+              <w:rPr>
+                <w:rtl/>
+                <w:cs/>
+              </w:rPr>
+            </w:r>
+            <w:r>
+              <w:rPr>
+                <w:rFonts w:ascii="Times New Roman" w:hAnsi="Times New Roman" w:cs="Noto Naskh Arabic"/>
+                <w:b w:val="0"/>
+                <w:i w:val="0"/>
+                <w:color w:val="111111"/>
+                <w:sz w:val="20"/>
+                <w:szCs w:val="20"/>
+                <w:rtl/>
+                <w:cs/>
+              </w:rPr>
+              <w:t>٨٫٤٪</w:t>
+            </w:r>
+          </w:p>
+        </w:tc>
+        <w:tc>
+          <w:tcPr>
+            <w:tcW w:type="dxa" w:w="1493"/>
+          </w:tcPr>
+          <w:p>
+            <w:pPr>
+              <w:bidi/>
+              <w:spacing w:before="60" w:after="60"/>
+              <w:jc w:val="right"/>
+            </w:pPr>
+            <w:r>
+              <w:rPr>
+                <w:rtl/>
+                <w:cs/>
+              </w:rPr>
+            </w:r>
+            <w:r>
+              <w:rPr>
+                <w:rFonts w:ascii="Times New Roman" w:hAnsi="Times New Roman" w:cs="Noto Naskh Arabic"/>
+                <w:b w:val="0"/>
+                <w:i w:val="0"/>
+                <w:color w:val="111111"/>
+                <w:sz w:val="20"/>
+                <w:szCs w:val="20"/>
+                <w:rtl/>
+                <w:cs/>
+              </w:rPr>
+              <w:t>٨٧٫٩٨٪</w:t>
+            </w:r>
+          </w:p>
+        </w:tc>
+        <w:tc>
+          <w:tcPr>
+            <w:tcW w:type="dxa" w:w="1493"/>
+          </w:tcPr>
+          <w:p>
+            <w:pPr>
+              <w:bidi/>
+              <w:spacing w:before="60" w:after="60"/>
+              <w:jc w:val="right"/>
+            </w:pPr>
+            <w:r>
+              <w:rPr>
+                <w:rtl/>
+                <w:cs/>
+              </w:rPr>
+            </w:r>
+            <w:r>
+              <w:rPr>
+                <w:rFonts w:ascii="Times New Roman" w:hAnsi="Times New Roman" w:cs="Noto Naskh Arabic"/>
+                <w:b w:val="0"/>
+                <w:i w:val="0"/>
+                <w:color w:val="111111"/>
+                <w:sz w:val="20"/>
+                <w:szCs w:val="20"/>
+                <w:rtl/>
+                <w:cs/>
+              </w:rPr>
+              <w:t>٨٨٫٩٪</w:t>
+            </w:r>
+          </w:p>
+        </w:tc>
+        <w:tc>
+          <w:tcPr>
+            <w:tcW w:type="dxa" w:w="1493"/>
+          </w:tcPr>
+          <w:p>
+            <w:pPr>
+              <w:bidi/>
+              <w:spacing w:before="60" w:after="60"/>
+              <w:jc w:val="right"/>
+            </w:pPr>
+            <w:r>
+              <w:rPr>
+                <w:rtl/>
+                <w:cs/>
+              </w:rPr>
+            </w:r>
+            <w:r>
+              <w:rPr>
+                <w:rFonts w:ascii="Times New Roman" w:hAnsi="Times New Roman" w:cs="Noto Naskh Arabic"/>
+                <w:b w:val="0"/>
+                <w:i w:val="0"/>
+                <w:color w:val="111111"/>
+                <w:sz w:val="20"/>
+                <w:szCs w:val="20"/>
+                <w:rtl/>
+                <w:cs/>
+              </w:rPr>
+              <w:t>٩٠٫٣٪</w:t>
+            </w:r>
+          </w:p>
+        </w:tc>
+      </w:tr>
+      <w:tr>
+        <w:tc>
+          <w:tcPr>
+            <w:tcW w:type="dxa" w:w="1493"/>
+          </w:tcPr>
+          <w:p>
+            <w:pPr>
+              <w:bidi/>
+              <w:spacing w:before="60" w:after="60"/>
+              <w:jc w:val="right"/>
+            </w:pPr>
+            <w:r>
+              <w:rPr>
+                <w:rtl/>
+                <w:cs/>
+              </w:rPr>
+            </w:r>
+            <w:r>
+              <w:rPr>
+                <w:rFonts w:ascii="Times New Roman" w:hAnsi="Times New Roman" w:cs="Noto Naskh Arabic"/>
+                <w:b w:val="0"/>
+                <w:i w:val="0"/>
+                <w:color w:val="111111"/>
+                <w:sz w:val="20"/>
+                <w:szCs w:val="20"/>
+                <w:rtl/>
+                <w:cs/>
+              </w:rPr>
+              <w:t>pepsi</w:t>
+            </w:r>
+          </w:p>
+        </w:tc>
+        <w:tc>
+          <w:tcPr>
+            <w:tcW w:type="dxa" w:w="1493"/>
+          </w:tcPr>
+          <w:p>
+            <w:pPr>
+              <w:bidi/>
+              <w:spacing w:before="60" w:after="60"/>
+              <w:jc w:val="right"/>
+            </w:pPr>
+            <w:r>
+              <w:rPr>
+                <w:rtl/>
+                <w:cs/>
+              </w:rPr>
+            </w:r>
+            <w:r>
+              <w:rPr>
+                <w:rFonts w:ascii="Times New Roman" w:hAnsi="Times New Roman" w:cs="Noto Naskh Arabic"/>
+                <w:b w:val="0"/>
+                <w:i w:val="0"/>
+                <w:color w:val="111111"/>
+                <w:sz w:val="20"/>
+                <w:szCs w:val="20"/>
+                <w:rtl/>
+                <w:cs/>
+              </w:rPr>
+              <w:t>١٣١</w:t>
+            </w:r>
+          </w:p>
+        </w:tc>
+        <w:tc>
+          <w:tcPr>
+            <w:tcW w:type="dxa" w:w="1493"/>
+          </w:tcPr>
+          <w:p>
+            <w:pPr>
+              <w:bidi/>
+              <w:spacing w:before="60" w:after="60"/>
+              <w:jc w:val="right"/>
+            </w:pPr>
+            <w:r>
+              <w:rPr>
+                <w:rtl/>
+                <w:cs/>
+              </w:rPr>
+            </w:r>
+            <w:r>
+              <w:rPr>
+                <w:rFonts w:ascii="Times New Roman" w:hAnsi="Times New Roman" w:cs="Noto Naskh Arabic"/>
+                <w:b w:val="0"/>
+                <w:i w:val="0"/>
+                <w:color w:val="111111"/>
+                <w:sz w:val="20"/>
+                <w:szCs w:val="20"/>
+                <w:rtl/>
+                <w:cs/>
+              </w:rPr>
+              <w:t>٢٫٧٪</w:t>
+            </w:r>
+          </w:p>
+        </w:tc>
+        <w:tc>
+          <w:tcPr>
+            <w:tcW w:type="dxa" w:w="1493"/>
+          </w:tcPr>
+          <w:p>
+            <w:pPr>
+              <w:bidi/>
+              <w:spacing w:before="60" w:after="60"/>
+              <w:jc w:val="right"/>
+            </w:pPr>
+            <w:r>
+              <w:rPr>
+                <w:rtl/>
+                <w:cs/>
+              </w:rPr>
+            </w:r>
+            <w:r>
+              <w:rPr>
+                <w:rFonts w:ascii="Times New Roman" w:hAnsi="Times New Roman" w:cs="Noto Naskh Arabic"/>
+                <w:b w:val="0"/>
+                <w:i w:val="0"/>
+                <w:color w:val="111111"/>
+                <w:sz w:val="20"/>
+                <w:szCs w:val="20"/>
+                <w:rtl/>
+                <w:cs/>
+              </w:rPr>
+              <w:t>—</w:t>
+            </w:r>
+          </w:p>
+        </w:tc>
+        <w:tc>
+          <w:tcPr>
+            <w:tcW w:type="dxa" w:w="1493"/>
+          </w:tcPr>
+          <w:p>
+            <w:pPr>
+              <w:bidi/>
+              <w:spacing w:before="60" w:after="60"/>
+              <w:jc w:val="right"/>
+            </w:pPr>
+            <w:r>
+              <w:rPr>
+                <w:rtl/>
+                <w:cs/>
+              </w:rPr>
+            </w:r>
+            <w:r>
+              <w:rPr>
+                <w:rFonts w:ascii="Times New Roman" w:hAnsi="Times New Roman" w:cs="Noto Naskh Arabic"/>
+                <w:b w:val="0"/>
+                <w:i w:val="0"/>
+                <w:color w:val="111111"/>
+                <w:sz w:val="20"/>
+                <w:szCs w:val="20"/>
+                <w:rtl/>
+                <w:cs/>
+              </w:rPr>
+              <w:t>٠٪</w:t>
+            </w:r>
+          </w:p>
+        </w:tc>
+        <w:tc>
+          <w:tcPr>
+            <w:tcW w:type="dxa" w:w="1493"/>
           </w:tcPr>
           <w:p>
             <w:pPr>
@@ -3799,6 +4237,48 @@
           <w:cs/>
         </w:rPr>
         <w:t>يتفاوت الأداء ٦٫٣٥ نقطة بين أقوى الأصناف المُمثَّلة وأضعفها، وينهار صنف pepsi كلياً لانعدام تمثيله في مجموعة الاختبار. وهذا هو تضوّر الإشارة بعينه: إشارة تدريب محدودة مقسومة على ستة أصناف تُنتج أداءً متفاوتاً يحدّه أضعف صنف، لا أقواه.</w:t>
+      </w:r>
+    </w:p>
+    <w:p>
+      <w:pPr>
+        <w:keepNext w:val="0"/>
+        <w:bidi/>
+        <w:spacing w:after="160" w:before="0" w:line="348" w:lineRule="auto"/>
+        <w:jc w:val="both"/>
+      </w:pPr>
+      <w:r>
+        <w:rPr>
+          <w:rFonts w:ascii="Times New Roman" w:hAnsi="Times New Roman" w:cs="Noto Naskh Arabic"/>
+          <w:b w:val="0"/>
+          <w:i w:val="0"/>
+          <w:color w:val="111111"/>
+          <w:sz w:val="23"/>
+          <w:szCs w:val="23"/>
+          <w:rtl/>
+          <w:cs/>
+        </w:rPr>
+        <w:t>ويستحق توزيع التعليم قراءةً دقيقة، لأنه لا يقول ما قد يُظن أنه يقوله. فالعلاقة بين عدد التعليمات والأداء ليست مطّردة بين الأصناف المُمثَّلة: يتفوّق xl_energy بـ ٦٦١ تعليماً على coca-cola بـ ٢٬٠٧٩ — أي أن مضاعفة البيانات ثلاث مرات لا تشتري بالضرورة دقة أعلى. والقراءة الصحيحة أن ثمة عتبةَ تمثيلٍ دنيا: فوقها يستقر الأداء في نطاق ضيّق لا يتحكم فيه الحجم وحده، وتحتها ينهار الصنف كلياً. وصنف pepsi، بحصة ٢٫٧٪، هو الوحيد الواقع تحت تلك العتبة — وهو الوحيد الذي انهار.</w:t>
+      </w:r>
+    </w:p>
+    <w:p>
+      <w:pPr>
+        <w:keepNext w:val="0"/>
+        <w:bidi/>
+        <w:spacing w:after="160" w:before="0" w:line="348" w:lineRule="auto"/>
+        <w:jc w:val="both"/>
+      </w:pPr>
+      <w:r>
+        <w:rPr>
+          <w:rFonts w:ascii="Times New Roman" w:hAnsi="Times New Roman" w:cs="Noto Naskh Arabic"/>
+          <w:b w:val="0"/>
+          <w:i w:val="0"/>
+          <w:color w:val="111111"/>
+          <w:sz w:val="23"/>
+          <w:szCs w:val="23"/>
+          <w:rtl/>
+          <w:cs/>
+        </w:rPr>
+        <w:t>والدلالة المعمارية أن المشكلة ليست في ندرة البيانات إجمالاً بل في اقتسامها. فالقسمة على ستة أصناف هي ما دفع أضعفها تحت عتبة التمثيل؛ ولو وُجِّهت الإشارة نفسها كلها إلى صنف واحد لما وُجدت أصناف تحت العتبة أصلاً. وهذا بالضبط ما يفعله النهج التالي.</w:t>
       </w:r>
     </w:p>
     <w:p>

</xml_diff>

<commit_message>
Add real app output for both approaches as qualitative evidence
Two field screenshots supplied from the app, placed where they carry an
argument rather than as decoration.

The v1 capture (75 detections) goes in section 5.2: every label sits at
brand level, which is that approach's ceiling by construction since its
classes are the brands. The v2 capture goes in section 5.3, where labels
are at flavour level — the routed variant layer's output, directly
comparable with the preceding figure.

The v2 figure's confidences are low (19-67%) and the caption says so
plainly, tying them to the measured 56.2% precision of the Cappy
classifier and to why the display threshold was lowered and active
learning aimed at that branch. Showing it honestly makes it evidence for
the method rather than a claim it contradicts.

Co-Authored-By: Claude Opus 5 <noreply@anthropic.com>
Claude-Session: https://claude.ai/code/session_012XpwBQVzqbnTeSceeR5m1B
</commit_message>
<xml_diff>
--- a/docs/report/out/Aystro_Research_Report_AR.docx
+++ b/docs/report/out/Aystro_Research_Report_AR.docx
@@ -2842,6 +2842,81 @@
     <w:p>
       <w:pPr>
         <w:keepNext/>
+        <w:spacing w:before="240" w:after="80"/>
+        <w:jc w:val="center"/>
+      </w:pPr>
+      <w:r>
+        <w:drawing>
+          <wp:inline xmlns:a="http://schemas.openxmlformats.org/drawingml/2006/main" xmlns:pic="http://schemas.openxmlformats.org/drawingml/2006/picture">
+            <wp:extent cx="3623486" cy="5580000"/>
+            <wp:docPr id="2" name="Picture 2"/>
+            <wp:cNvGraphicFramePr>
+              <a:graphicFrameLocks noChangeAspect="1"/>
+            </wp:cNvGraphicFramePr>
+            <a:graphic>
+              <a:graphicData uri="http://schemas.openxmlformats.org/drawingml/2006/picture">
+                <pic:pic>
+                  <pic:nvPicPr>
+                    <pic:cNvPr id="0" name="fig_app_v1.jpg"/>
+                    <pic:cNvPicPr/>
+                  </pic:nvPicPr>
+                  <pic:blipFill>
+                    <a:blip r:embed="rId10"/>
+                    <a:stretch>
+                      <a:fillRect/>
+                    </a:stretch>
+                  </pic:blipFill>
+                  <pic:spPr>
+                    <a:xfrm>
+                      <a:off x="0" y="0"/>
+                      <a:ext cx="3623486" cy="5580000"/>
+                    </a:xfrm>
+                    <a:prstGeom prst="rect"/>
+                  </pic:spPr>
+                </pic:pic>
+              </a:graphicData>
+            </a:graphic>
+          </wp:inline>
+        </w:drawing>
+      </w:r>
+    </w:p>
+    <w:p>
+      <w:pPr>
+        <w:bidi/>
+        <w:spacing w:after="280"/>
+        <w:jc w:val="center"/>
+      </w:pPr>
+      <w:r>
+        <w:rPr>
+          <w:rFonts w:ascii="Times New Roman" w:hAnsi="Times New Roman" w:cs="Noto Naskh Arabic"/>
+          <w:b/>
+          <w:bCs w:val="1"/>
+          <w:i w:val="0"/>
+          <w:color w:val="555555"/>
+          <w:sz w:val="19"/>
+          <w:szCs w:val="19"/>
+          <w:rtl/>
+          <w:cs/>
+        </w:rPr>
+        <w:t xml:space="preserve">الشكل ٢. </w:t>
+      </w:r>
+      <w:r>
+        <w:rPr>
+          <w:rFonts w:ascii="Times New Roman" w:hAnsi="Times New Roman" w:cs="Noto Naskh Arabic"/>
+          <w:b w:val="0"/>
+          <w:i w:val="0"/>
+          <w:color w:val="555555"/>
+          <w:sz w:val="19"/>
+          <w:szCs w:val="19"/>
+          <w:rtl/>
+          <w:cs/>
+        </w:rPr>
+        <w:t>مُخرَج النهج الأحادي على رفّ حقيقي: ٧٥ اكتشافاً، وكل تسمية عند مستوى العلامة التجارية وحده — وهو سقف هذا النهج بحكم بنيته، إذ إن أصنافه هي العلامات نفسها. وحصص الرف في الأسفل محسوبة عند المستوى ذاته. كما تظهر هنا ظروف المجال التي يصفها القسم ٧: كثافة عرض عالية، وحجب متبادل، وانعكاسات على الزجاج.</w:t>
+      </w:r>
+    </w:p>
+    <w:p>
+      <w:pPr>
+        <w:keepNext/>
         <w:bidi/>
         <w:spacing w:before="240" w:after="100"/>
         <w:jc w:val="center"/>
@@ -4312,7 +4387,7 @@
         <w:drawing>
           <wp:inline xmlns:a="http://schemas.openxmlformats.org/drawingml/2006/main" xmlns:pic="http://schemas.openxmlformats.org/drawingml/2006/picture">
             <wp:extent cx="5544000" cy="2128369"/>
-            <wp:docPr id="2" name="Picture 2"/>
+            <wp:docPr id="3" name="Picture 3"/>
             <wp:cNvGraphicFramePr>
               <a:graphicFrameLocks noChangeAspect="1"/>
             </wp:cNvGraphicFramePr>
@@ -4324,7 +4399,7 @@
                     <pic:cNvPicPr/>
                   </pic:nvPicPr>
                   <pic:blipFill>
-                    <a:blip r:embed="rId10"/>
+                    <a:blip r:embed="rId11"/>
                     <a:stretch>
                       <a:fillRect/>
                     </a:stretch>
@@ -4361,7 +4436,7 @@
           <w:rtl/>
           <w:cs/>
         </w:rPr>
-        <w:t xml:space="preserve">الشكل ٢. </w:t>
+        <w:t xml:space="preserve">الشكل ٣. </w:t>
       </w:r>
       <w:r>
         <w:rPr>
@@ -5788,6 +5863,81 @@
           <w:cs/>
         </w:rPr>
         <w:t>ويكشف تحليل هذه النتائج نمطاً واحداً منتظماً: كل صنف ضعيف يقابله عدد عيّنات ضئيل قابل للعدّ — ثلاث عيّنات اختبار للزجاج، وخمس صور مصدرية لـ coca-diet، وما بين عيّنة وستّ عيّنات لكل صنف من أصناف Cappy الضعيفة. ومصفوفات الالتباس تُظهر أن الأخطاء التباسات معقولة بين فئات متقاربة بصرياً (الليمون مع المانجو، وdiet مع classic)، لا تشتّتاً عشوائياً — وهو ما يميّز نقص البيانات عن قصور النمذجة تمييزاً قابلاً للفحص.</w:t>
+      </w:r>
+    </w:p>
+    <w:p>
+      <w:pPr>
+        <w:keepNext/>
+        <w:spacing w:before="240" w:after="80"/>
+        <w:jc w:val="center"/>
+      </w:pPr>
+      <w:r>
+        <w:drawing>
+          <wp:inline xmlns:a="http://schemas.openxmlformats.org/drawingml/2006/main" xmlns:pic="http://schemas.openxmlformats.org/drawingml/2006/picture">
+            <wp:extent cx="5544000" cy="4032000"/>
+            <wp:docPr id="4" name="Picture 4"/>
+            <wp:cNvGraphicFramePr>
+              <a:graphicFrameLocks noChangeAspect="1"/>
+            </wp:cNvGraphicFramePr>
+            <a:graphic>
+              <a:graphicData uri="http://schemas.openxmlformats.org/drawingml/2006/picture">
+                <pic:pic>
+                  <pic:nvPicPr>
+                    <pic:cNvPr id="0" name="fig_app_v2_variants.jpg"/>
+                    <pic:cNvPicPr/>
+                  </pic:nvPicPr>
+                  <pic:blipFill>
+                    <a:blip r:embed="rId12"/>
+                    <a:stretch>
+                      <a:fillRect/>
+                    </a:stretch>
+                  </pic:blipFill>
+                  <pic:spPr>
+                    <a:xfrm>
+                      <a:off x="0" y="0"/>
+                      <a:ext cx="5544000" cy="4032000"/>
+                    </a:xfrm>
+                    <a:prstGeom prst="rect"/>
+                  </pic:spPr>
+                </pic:pic>
+              </a:graphicData>
+            </a:graphic>
+          </wp:inline>
+        </w:drawing>
+      </w:r>
+    </w:p>
+    <w:p>
+      <w:pPr>
+        <w:bidi/>
+        <w:spacing w:after="280"/>
+        <w:jc w:val="center"/>
+      </w:pPr>
+      <w:r>
+        <w:rPr>
+          <w:rFonts w:ascii="Times New Roman" w:hAnsi="Times New Roman" w:cs="Noto Naskh Arabic"/>
+          <w:b/>
+          <w:bCs w:val="1"/>
+          <w:i w:val="0"/>
+          <w:color w:val="555555"/>
+          <w:sz w:val="19"/>
+          <w:szCs w:val="19"/>
+          <w:rtl/>
+          <w:cs/>
+        </w:rPr>
+        <w:t xml:space="preserve">الشكل ٤. </w:t>
+      </w:r>
+      <w:r>
+        <w:rPr>
+          <w:rFonts w:ascii="Times New Roman" w:hAnsi="Times New Roman" w:cs="Noto Naskh Arabic"/>
+          <w:b w:val="0"/>
+          <w:i w:val="0"/>
+          <w:color w:val="555555"/>
+          <w:sz w:val="19"/>
+          <w:szCs w:val="19"/>
+          <w:rtl/>
+          <w:cs/>
+        </w:rPr>
+        <w:t>المعمارية متعددة الطبقات على رفّ Cappy حقيقي: التسمية هنا عند مستوى النكهة (orange / mango / grape / lemon / strawberry) لا عند مستوى العلامة — وهذا ما تُنتجه طبقة المتغيّرات الموجَّهة، ويُقارَن مباشرةً بالشكل السابق. والثقات المنخفضة الظاهرة (١٩٪–٦٧٪) ليست عيباً في العرض بل انعكاس أمين لما يقيسه هذا القسم: مُصنِّف Cappy أضعف حلقة في المنظومة بإحكام ٥٦٫٢٪. وهي بعينها الحالة التي أوجبت خفض عتبة العرض إلى ٠٫٤ (القسم ٧) وتوجيه التعلّم النشط إلى هذا الفرع (القسم ٦) — إذ لا يمكن تصحيح ما لا يُعرَض.</w:t>
       </w:r>
     </w:p>
     <w:p>
@@ -6364,7 +6514,7 @@
         <w:drawing>
           <wp:inline xmlns:a="http://schemas.openxmlformats.org/drawingml/2006/main" xmlns:pic="http://schemas.openxmlformats.org/drawingml/2006/picture">
             <wp:extent cx="5544000" cy="2121138"/>
-            <wp:docPr id="3" name="Picture 3"/>
+            <wp:docPr id="5" name="Picture 5"/>
             <wp:cNvGraphicFramePr>
               <a:graphicFrameLocks noChangeAspect="1"/>
             </wp:cNvGraphicFramePr>
@@ -6376,7 +6526,7 @@
                     <pic:cNvPicPr/>
                   </pic:nvPicPr>
                   <pic:blipFill>
-                    <a:blip r:embed="rId11"/>
+                    <a:blip r:embed="rId13"/>
                     <a:stretch>
                       <a:fillRect/>
                     </a:stretch>
@@ -6413,7 +6563,7 @@
           <w:rtl/>
           <w:cs/>
         </w:rPr>
-        <w:t xml:space="preserve">الشكل ٣. </w:t>
+        <w:t xml:space="preserve">الشكل ٥. </w:t>
       </w:r>
       <w:r>
         <w:rPr>

</xml_diff>